<commit_message>
Update docs for Boot 4.1 / Java 25 / Jackson 3, v1.0.0, and the confirmed AKS target
- SOLUTION_DESIGN: tech stack refreshed (Spring Boot 4.1, Java 25, Jackson 3,
  Hibernate 7, modularized Boot starters, Maven wrapper removal); pe-sub-jobs described
  as the Spring Batch 6 CSV ingestion service; AKS confirmed as compute target (UBS
  Azure catalog offers Functions/AKS/Web Apps only — no Container Apps)
- openapi.yaml / openapi-extraction.yaml: stack references updated; extraction spec
  version aligned to 1.0.0 (postman collection sync note updated to match)
- README: repo table now includes pe-sub-jobs and pe-sub-infra with current stacks
- EXTRACTION_CONTRACT: stack line updated
- Solution Design v2 docx regenerated from the updated generator

Co-Authored-By: Claude Fable 5 <noreply@anthropic.com>
</commit_message>
<xml_diff>
--- a/PE-Sub-Platform-Solution-Design-v2.docx
+++ b/PE-Sub-Platform-Solution-Design-v2.docx
@@ -1160,7 +1160,7 @@
                 <w:sz w:val="20"/>
                 <w:szCs w:val="20"/>
               </w:rPr>
-              <w:t xml:space="preserve">Spring Boot 3.5 · Java 21 · PostgreSQL 16 · Flyway</w:t>
+              <w:t xml:space="preserve">Spring Boot 4.1 · Java 25 · PostgreSQL 16 · Flyway</w:t>
             </w:r>
           </w:p>
         </w:tc>
@@ -1214,7 +1214,7 @@
                 <w:sz w:val="20"/>
                 <w:szCs w:val="20"/>
               </w:rPr>
-              <w:t xml:space="preserve">Spring Boot 3.5 · Java 21 · Apache POI / Commons CSV</w:t>
+              <w:t xml:space="preserve">Spring Boot 4.1 · Java 25 · Apache POI / Commons CSV</w:t>
             </w:r>
           </w:p>
         </w:tc>
@@ -1268,7 +1268,7 @@
                 <w:sz w:val="20"/>
                 <w:szCs w:val="20"/>
               </w:rPr>
-              <w:t xml:space="preserve">Spring Boot 3.5 · Spring Batch</w:t>
+              <w:t xml:space="preserve">Spring Boot 4.1 · Java 25 · Spring Batch 6</w:t>
             </w:r>
           </w:p>
         </w:tc>
@@ -1290,7 +1290,7 @@
                 <w:sz w:val="20"/>
                 <w:szCs w:val="20"/>
               </w:rPr>
-              <w:t xml:space="preserve">Background jobs service (seed/ingest jobs; scheduled recalculation planned)</w:t>
+              <w:t xml:space="preserve">CSV ingestion jobs (facility-ingest, lp-master-ingest) upserting into the shared PostgreSQL; scheduled recalculation planned</w:t>
             </w:r>
           </w:p>
         </w:tc>

</xml_diff>

<commit_message>
Major rework this week (ITA vacation)
</commit_message>
<xml_diff>
--- a/PE-Sub-Platform-Solution-Design-v2.docx
+++ b/PE-Sub-Platform-Solution-Design-v2.docx
@@ -418,7 +418,7 @@
           <w:sz w:val="22"/>
           <w:szCs w:val="22"/>
         </w:rPr>
-        <w:t xml:space="preserve">Shadow BB calculation engine (Java, authoritative; TypeScript twin for live preview) with five-tier BUSA advance rates, per-LP concentration caps, breach detection, and append-only JSONB snapshots</w:t>
+        <w:t>Shadow BB calculation engine (Java, authoritative; TypeScript twin for live preview) with six-tier BUSA advance rates, per-LP concentration caps, breach detection, and append-only JSONB snapshots</w:t>
       </w:r>
     </w:p>
     <w:p>
@@ -503,7 +503,7 @@
           <w:sz w:val="22"/>
           <w:szCs w:val="22"/>
         </w:rPr>
-        <w:t xml:space="preserve">OpenAPI 3.0 specification v0.8.0 (with security schemes) and a maintained Postman/Talend collection</w:t>
+        <w:t>OpenAPI 3.0 specification v0.9.0 (with security schemes) and a maintained Postman/Talend collection</w:t>
       </w:r>
     </w:p>
     <w:p>
@@ -899,7 +899,7 @@
           <w:sz w:val="22"/>
           <w:szCs w:val="22"/>
         </w:rPr>
-        <w:t xml:space="preserve">Advance rates are five-tier by UBS LP Classification: Rated 90% · Unrated AUM &gt;$2bn 75% · Unrated $1–2bn 65% · Eligible &lt;$1bn 50% · Excluded 0% (BUSA schedule; the agent applies its own schedule, so LP-level rate variance drives the BB delta)</w:t>
+        <w:t>Advance rates are six-tier by UBS LP Classification: Rated Investor 90% · Unrated NAV &gt; $1Bn 75% · FoF &amp; Other &gt; $10Bn AUM 75% · Corp Pension &gt; $5Bn Assets 65% · Other Institutional 50% · Excluded 0% (BUSA schedule; the agent applies its own schedule keyed on agent categories, so LP-level rate variance drives the BB delta)</w:t>
       </w:r>
     </w:p>
     <w:p>
@@ -916,7 +916,7 @@
           <w:sz w:val="22"/>
           <w:szCs w:val="22"/>
         </w:rPr>
-        <w:t xml:space="preserve">Concentration limits apply at the individual-LP level, always against total uncalled capital (not facility size); some facilities add a class-level cap on top</w:t>
+        <w:t>Concentration limits apply at the individual-LP level, always against total uncalled capital (not facility size); the per-LP limit is a percent of total uncalled defaulted by UBS classification (cls_conc_limit_defaults, with a warn-only accepted range cls_conc_limit_bounds); some facilities add an aggregate class-level cap on top</w:t>
       </w:r>
     </w:p>
     <w:p>
@@ -1106,7 +1106,7 @@
                 <w:sz w:val="20"/>
                 <w:szCs w:val="20"/>
               </w:rPr>
-              <w:t xml:space="preserve">React 18 · TypeScript 5 · Vite (Context API — no Redux)</w:t>
+              <w:t>React 18 · TypeScript 5 · Vite 6 (Redux Toolkit store for config/global state; Context/useState for local UI)</w:t>
             </w:r>
           </w:p>
         </w:tc>
@@ -1290,7 +1290,7 @@
                 <w:sz w:val="20"/>
                 <w:szCs w:val="20"/>
               </w:rPr>
-              <w:t xml:space="preserve">CSV ingestion jobs (facility-ingest, lp-master-ingest) upserting into the shared PostgreSQL; scheduled recalculation planned</w:t>
+              <w:t>Spring Batch CSV/feed jobs (facility-ingest, lp-master-ingest, lp-records-seed, cls-conc-limits-ingest) and a BB-template directory importer, upserting into the shared PostgreSQL; jobs call POST /api/config/reload after config feeds; scheduled recalculation planned</w:t>
             </w:r>
           </w:p>
         </w:tc>
@@ -1847,7 +1847,7 @@
                 <w:sz w:val="20"/>
                 <w:szCs w:val="20"/>
               </w:rPr>
-              <w:t xml:space="preserve">LP Master — one row per LP per facility; ~40 columns across Identity, Classification, Ratings, Financial Scale, Commitment, Uncalled, Concentration/BB, and Status groups (see MASTER_DB_MAPPING.md)</w:t>
+              <w:t>LP Master — one row per LP per facility; ~40 columns across Identity, Classification, Ratings, Financial Scale, Commitment, Uncalled, Concentration/BB, and Status groups, plus fund_sleeve (source-tab provenance) and lp_rank (uncalled-capital rank set by the Shadow BB run) — see MASTER_DB_MAPPING.md</w:t>
             </w:r>
           </w:p>
         </w:tc>
@@ -2053,7 +2053,7 @@
                 <w:sz w:val="20"/>
                 <w:szCs w:val="20"/>
               </w:rPr>
-              <w:t xml:space="preserve">Key/value JSONB configuration: busa_tiers, agent_tiers, agent_rate_params, elig_rules, conc_limits, global_settings, matching_config, classification_config; cached in-memory, upserted via PUT /api/config/*</w:t>
+              <w:t>Key/value JSONB configuration: busa_tiers, agent_tiers, agent_rate_params, elig_rules, conc_limits, cls_conc_limit_defaults, cls_conc_limit_bounds, global_settings, matching_config, classification_config; cached in-memory, upserted via PUT /api/config/* and hot-reloaded via POST /api/config/reload</w:t>
             </w:r>
           </w:p>
         </w:tc>
@@ -2285,7 +2285,7 @@
           <w:sz w:val="22"/>
           <w:szCs w:val="22"/>
         </w:rPr>
-        <w:t xml:space="preserve">All endpoints are RESTful JSON under /api on pe-sub-api (port 3001). The full contract is OpenAPI 3.0 (openapi.yaml v0.8.0, including security schemes); the Postman/Talend collection mirrors it with auth headers pre-configured. Route families:</w:t>
+        <w:t>All endpoints are RESTful JSON under /api on pe-sub-api (port 3001). The full contract is OpenAPI 3.0 (openapi.yaml v0.9.0, including security schemes); the Postman/Talend collection mirrors it with auth headers pre-configured. Route families:</w:t>
       </w:r>
     </w:p>
     <w:tbl>
@@ -3778,7 +3778,7 @@
           <w:sz w:val="22"/>
           <w:szCs w:val="22"/>
         </w:rPr>
-        <w:t xml:space="preserve">Column headers map to canonical fields through the live, bank-scopable alias dictionary (e.g. "Remaining Callable Capital" → Uncalled). Unrecognised columns surface in the wizard, where the analyst can map them on the spot — the new alias is written back to the dictionary and the file re-extracts immediately. Derived columns present in agent files (BB contribution percentages, eligible-commitment computations, aggregates) are extracted for cross-check display but never persisted.</w:t>
+        <w:t>Column headers map to canonical fields through the live, bank-scopable alias dictionary (e.g. "Remaining Callable Capital" → Uncalled). Unrecognised columns surface in the wizard, where the analyst can map them on the spot — the new alias is written back to the dictionary and the file re-extracts immediately. Derived columns present in agent files (BB contribution percentages, eligible-commitment computations, aggregates) are extracted for cross-check display but never persisted. Conversely, where the workbook omits a canonical field, the engine derives it per fund sleeve (Called Capital, % of Capital Commitments, Concentration %, Excess Concentration %) and marks it “Derived:” so it reads as a cross-check, not an agent figure.</w:t>
       </w:r>
     </w:p>
     <w:p>
@@ -4142,7 +4142,7 @@
                 <w:sz w:val="20"/>
                 <w:szCs w:val="20"/>
               </w:rPr>
-              <w:t xml:space="preserve">UBS LP Classification</w:t>
+              <w:t>UBS LP Classification</w:t>
             </w:r>
           </w:p>
         </w:tc>
@@ -4162,7 +4162,7 @@
                 <w:sz w:val="20"/>
                 <w:szCs w:val="20"/>
               </w:rPr>
-              <w:t xml:space="preserve">BUSA rate</w:t>
+              <w:t>BUSA rate</w:t>
             </w:r>
           </w:p>
         </w:tc>
@@ -4182,219 +4182,251 @@
                 <w:sz w:val="20"/>
                 <w:szCs w:val="20"/>
               </w:rPr>
-              <w:t xml:space="preserve">Agent rate (typical)</w:t>
-            </w:r>
-          </w:p>
-        </w:tc>
-      </w:tr>
-      <w:tr>
-        <w:tc>
-          <w:tcPr>
-            <w:shd w:fill="F2F4F8" w:val="clear"/>
-          </w:tcPr>
-          <w:p>
-            <w:r>
-              <w:rPr>
-                <w:b/>
-                <w:bCs/>
-                <w:sz w:val="20"/>
-                <w:szCs w:val="20"/>
-              </w:rPr>
-              <w:t xml:space="preserve">Rated (investment grade)</w:t>
-            </w:r>
-          </w:p>
-        </w:tc>
-        <w:tc>
-          <w:tcPr>
-            <w:shd w:fill="F2F4F8" w:val="clear"/>
-          </w:tcPr>
-          <w:p>
-            <w:r>
-              <w:rPr>
-                <w:sz w:val="20"/>
-                <w:szCs w:val="20"/>
-              </w:rPr>
-              <w:t xml:space="preserve">90%</w:t>
-            </w:r>
-          </w:p>
-        </w:tc>
-        <w:tc>
-          <w:tcPr>
-            <w:shd w:fill="F2F4F8" w:val="clear"/>
-          </w:tcPr>
-          <w:p>
-            <w:r>
-              <w:rPr>
-                <w:sz w:val="20"/>
-                <w:szCs w:val="20"/>
-              </w:rPr>
-              <w:t xml:space="preserve">95%</w:t>
-            </w:r>
-          </w:p>
-        </w:tc>
-      </w:tr>
-      <w:tr>
-        <w:tc>
-          <w:p>
-            <w:r>
-              <w:rPr>
-                <w:b/>
-                <w:bCs/>
-                <w:sz w:val="20"/>
-                <w:szCs w:val="20"/>
-              </w:rPr>
-              <w:t xml:space="preserve">Unrated, AUM &gt; $2bn</w:t>
-            </w:r>
-          </w:p>
-        </w:tc>
-        <w:tc>
-          <w:p>
-            <w:r>
-              <w:rPr>
-                <w:sz w:val="20"/>
-                <w:szCs w:val="20"/>
-              </w:rPr>
-              <w:t xml:space="preserve">75%</w:t>
-            </w:r>
-          </w:p>
-        </w:tc>
-        <w:tc>
-          <w:p>
-            <w:r>
-              <w:rPr>
-                <w:sz w:val="20"/>
-                <w:szCs w:val="20"/>
-              </w:rPr>
-              <w:t xml:space="preserve">75%</w:t>
-            </w:r>
-          </w:p>
-        </w:tc>
-      </w:tr>
-      <w:tr>
-        <w:tc>
-          <w:tcPr>
-            <w:shd w:fill="F2F4F8" w:val="clear"/>
-          </w:tcPr>
-          <w:p>
-            <w:r>
-              <w:rPr>
-                <w:b/>
-                <w:bCs/>
-                <w:sz w:val="20"/>
-                <w:szCs w:val="20"/>
-              </w:rPr>
-              <w:t xml:space="preserve">Unrated, AUM $1–2bn</w:t>
-            </w:r>
-          </w:p>
-        </w:tc>
-        <w:tc>
-          <w:tcPr>
-            <w:shd w:fill="F2F4F8" w:val="clear"/>
-          </w:tcPr>
-          <w:p>
-            <w:r>
-              <w:rPr>
-                <w:sz w:val="20"/>
-                <w:szCs w:val="20"/>
-              </w:rPr>
-              <w:t xml:space="preserve">65%</w:t>
-            </w:r>
-          </w:p>
-        </w:tc>
-        <w:tc>
-          <w:tcPr>
-            <w:shd w:fill="F2F4F8" w:val="clear"/>
-          </w:tcPr>
-          <w:p>
-            <w:r>
-              <w:rPr>
-                <w:sz w:val="20"/>
-                <w:szCs w:val="20"/>
-              </w:rPr>
-              <w:t xml:space="preserve">75%</w:t>
-            </w:r>
-          </w:p>
-        </w:tc>
-      </w:tr>
-      <w:tr>
-        <w:tc>
-          <w:p>
-            <w:r>
-              <w:rPr>
-                <w:b/>
-                <w:bCs/>
-                <w:sz w:val="20"/>
-                <w:szCs w:val="20"/>
-              </w:rPr>
-              <w:t xml:space="preserve">Eligible, AUM &lt; $1bn</w:t>
-            </w:r>
-          </w:p>
-        </w:tc>
-        <w:tc>
-          <w:p>
-            <w:r>
-              <w:rPr>
-                <w:sz w:val="20"/>
-                <w:szCs w:val="20"/>
-              </w:rPr>
-              <w:t xml:space="preserve">50%</w:t>
-            </w:r>
-          </w:p>
-        </w:tc>
-        <w:tc>
-          <w:p>
-            <w:r>
-              <w:rPr>
-                <w:sz w:val="20"/>
-                <w:szCs w:val="20"/>
-              </w:rPr>
-              <w:t xml:space="preserve">n/a</w:t>
-            </w:r>
-          </w:p>
-        </w:tc>
-      </w:tr>
-      <w:tr>
-        <w:tc>
-          <w:tcPr>
-            <w:shd w:fill="F2F4F8" w:val="clear"/>
-          </w:tcPr>
-          <w:p>
-            <w:r>
-              <w:rPr>
-                <w:b/>
-                <w:bCs/>
-                <w:sz w:val="20"/>
-                <w:szCs w:val="20"/>
-              </w:rPr>
-              <w:t xml:space="preserve">Excluded</w:t>
-            </w:r>
-          </w:p>
-        </w:tc>
-        <w:tc>
-          <w:tcPr>
-            <w:shd w:fill="F2F4F8" w:val="clear"/>
-          </w:tcPr>
-          <w:p>
-            <w:r>
-              <w:rPr>
-                <w:sz w:val="20"/>
-                <w:szCs w:val="20"/>
-              </w:rPr>
-              <w:t xml:space="preserve">0%</w:t>
-            </w:r>
-          </w:p>
-        </w:tc>
-        <w:tc>
-          <w:tcPr>
-            <w:shd w:fill="F2F4F8" w:val="clear"/>
-          </w:tcPr>
-          <w:p>
-            <w:r>
-              <w:rPr>
-                <w:sz w:val="20"/>
-                <w:szCs w:val="20"/>
-              </w:rPr>
-              <w:t xml:space="preserve">0%</w:t>
+              <w:t>Default per-LP conc. limit (% uncalled)</w:t>
+            </w:r>
+          </w:p>
+        </w:tc>
+      </w:tr>
+      <w:tr>
+        <w:tc>
+          <w:tcPr>
+            <w:shd w:fill="F2F4F8" w:val="clear"/>
+          </w:tcPr>
+          <w:p>
+            <w:r>
+              <w:rPr>
+                <w:b/>
+                <w:bCs/>
+                <w:sz w:val="20"/>
+                <w:szCs w:val="20"/>
+              </w:rPr>
+              <w:t>Rated Investor</w:t>
+            </w:r>
+          </w:p>
+        </w:tc>
+        <w:tc>
+          <w:tcPr>
+            <w:shd w:fill="F2F4F8" w:val="clear"/>
+          </w:tcPr>
+          <w:p>
+            <w:r>
+              <w:rPr>
+                <w:sz w:val="20"/>
+                <w:szCs w:val="20"/>
+              </w:rPr>
+              <w:t>90%</w:t>
+            </w:r>
+          </w:p>
+        </w:tc>
+        <w:tc>
+          <w:tcPr>
+            <w:shd w:fill="F2F4F8" w:val="clear"/>
+          </w:tcPr>
+          <w:p>
+            <w:r>
+              <w:rPr>
+                <w:sz w:val="20"/>
+                <w:szCs w:val="20"/>
+              </w:rPr>
+              <w:t>20.0%</w:t>
+            </w:r>
+          </w:p>
+        </w:tc>
+      </w:tr>
+      <w:tr>
+        <w:tc>
+          <w:p>
+            <w:r>
+              <w:rPr>
+                <w:b/>
+                <w:bCs/>
+                <w:sz w:val="20"/>
+                <w:szCs w:val="20"/>
+              </w:rPr>
+              <w:t>Unrated NAV &gt; $1Bn</w:t>
+            </w:r>
+          </w:p>
+        </w:tc>
+        <w:tc>
+          <w:p>
+            <w:r>
+              <w:rPr>
+                <w:sz w:val="20"/>
+                <w:szCs w:val="20"/>
+              </w:rPr>
+              <w:t>75%</w:t>
+            </w:r>
+          </w:p>
+        </w:tc>
+        <w:tc>
+          <w:p>
+            <w:r>
+              <w:rPr>
+                <w:sz w:val="20"/>
+                <w:szCs w:val="20"/>
+              </w:rPr>
+              <w:t>15.0%</w:t>
+            </w:r>
+          </w:p>
+        </w:tc>
+      </w:tr>
+      <w:tr>
+        <w:tc>
+          <w:tcPr>
+            <w:shd w:fill="F2F4F8" w:val="clear"/>
+          </w:tcPr>
+          <w:p>
+            <w:r>
+              <w:rPr>
+                <w:b/>
+                <w:bCs/>
+                <w:sz w:val="20"/>
+                <w:szCs w:val="20"/>
+              </w:rPr>
+              <w:t>FoF &amp; Other &gt; $10Bn AUM</w:t>
+            </w:r>
+          </w:p>
+        </w:tc>
+        <w:tc>
+          <w:tcPr>
+            <w:shd w:fill="F2F4F8" w:val="clear"/>
+          </w:tcPr>
+          <w:p>
+            <w:r>
+              <w:rPr>
+                <w:sz w:val="20"/>
+                <w:szCs w:val="20"/>
+              </w:rPr>
+              <w:t>75%</w:t>
+            </w:r>
+          </w:p>
+        </w:tc>
+        <w:tc>
+          <w:tcPr>
+            <w:shd w:fill="F2F4F8" w:val="clear"/>
+          </w:tcPr>
+          <w:p>
+            <w:r>
+              <w:rPr>
+                <w:sz w:val="20"/>
+                <w:szCs w:val="20"/>
+              </w:rPr>
+              <w:t>10.0%</w:t>
+            </w:r>
+          </w:p>
+        </w:tc>
+      </w:tr>
+      <w:tr>
+        <w:tc>
+          <w:p>
+            <w:r>
+              <w:rPr>
+                <w:b/>
+                <w:bCs/>
+                <w:sz w:val="20"/>
+                <w:szCs w:val="20"/>
+              </w:rPr>
+              <w:t>Corp Pension &gt; $5Bn Assets</w:t>
+            </w:r>
+          </w:p>
+        </w:tc>
+        <w:tc>
+          <w:p>
+            <w:r>
+              <w:rPr>
+                <w:sz w:val="20"/>
+                <w:szCs w:val="20"/>
+              </w:rPr>
+              <w:t>65%</w:t>
+            </w:r>
+          </w:p>
+        </w:tc>
+        <w:tc>
+          <w:p>
+            <w:r>
+              <w:rPr>
+                <w:sz w:val="20"/>
+                <w:szCs w:val="20"/>
+              </w:rPr>
+              <w:t>12.5%</w:t>
+            </w:r>
+          </w:p>
+        </w:tc>
+      </w:tr>
+      <w:tr>
+        <w:tc>
+          <w:tcPr>
+            <w:shd w:fill="F2F4F8" w:val="clear"/>
+          </w:tcPr>
+          <w:p>
+            <w:r>
+              <w:rPr>
+                <w:b/>
+                <w:bCs/>
+                <w:sz w:val="20"/>
+                <w:szCs w:val="20"/>
+              </w:rPr>
+              <w:t>Other Institutional</w:t>
+            </w:r>
+          </w:p>
+        </w:tc>
+        <w:tc>
+          <w:tcPr>
+            <w:shd w:fill="F2F4F8" w:val="clear"/>
+          </w:tcPr>
+          <w:p>
+            <w:r>
+              <w:rPr>
+                <w:sz w:val="20"/>
+                <w:szCs w:val="20"/>
+              </w:rPr>
+              <w:t>50%</w:t>
+            </w:r>
+          </w:p>
+        </w:tc>
+        <w:tc>
+          <w:tcPr>
+            <w:shd w:fill="F2F4F8" w:val="clear"/>
+          </w:tcPr>
+          <w:p>
+            <w:r>
+              <w:rPr>
+                <w:sz w:val="20"/>
+                <w:szCs w:val="20"/>
+              </w:rPr>
+              <w:t>7.5%</w:t>
+            </w:r>
+          </w:p>
+        </w:tc>
+      </w:tr>
+      <w:tr>
+        <w:tc>
+          <w:tcPr>
+            <w:tcW w:type="dxa" w:w="100"/>
+          </w:tcPr>
+          <w:p>
+            <w:r>
+              <w:t>Excluded</w:t>
+            </w:r>
+          </w:p>
+        </w:tc>
+        <w:tc>
+          <w:tcPr>
+            <w:tcW w:type="dxa" w:w="100"/>
+          </w:tcPr>
+          <w:p>
+            <w:r>
+              <w:t>0%</w:t>
+            </w:r>
+          </w:p>
+        </w:tc>
+        <w:tc>
+          <w:tcPr>
+            <w:tcW w:type="dxa" w:w="100"/>
+          </w:tcPr>
+          <w:p>
+            <w:r>
+              <w:t>0.0%</w:t>
             </w:r>
           </w:p>
         </w:tc>
@@ -5068,18 +5100,18 @@
                 <w:sz w:val="20"/>
                 <w:szCs w:val="20"/>
               </w:rPr>
-              <w:t xml:space="preserve">Advance-rate schedule tier values and per-tier concentration limits</w:t>
-            </w:r>
-          </w:p>
-        </w:tc>
-        <w:tc>
-          <w:p>
-            <w:r>
-              <w:rPr>
-                <w:sz w:val="20"/>
-                <w:szCs w:val="20"/>
-              </w:rPr>
-              <w:t xml:space="preserve">Awaiting PE Sub Management confirmation before correcting seed data</w:t>
+              <w:t>Inline concentration-limit column on the rate-schedule screens; independent BUSA vs Agent CLs</w:t>
+            </w:r>
+          </w:p>
+        </w:tc>
+        <w:tc>
+          <w:p>
+            <w:r>
+              <w:rPr>
+                <w:sz w:val="20"/>
+                <w:szCs w:val="20"/>
+              </w:rPr>
+              <w:t>Partly resolved (July 2026): tiers unified and re-seeded; per-tier per-LP concentration defaults now held in cls_conc_limit_defaults/bounds. Open: whether the Config rate screens should also show an inline CL column</w:t>
             </w:r>
           </w:p>
         </w:tc>
@@ -5457,7 +5489,7 @@
                 <w:sz w:val="20"/>
                 <w:szCs w:val="20"/>
               </w:rPr>
-              <w:t xml:space="preserve">The platform-computed advance-rate tier (Rated / Unrated &gt;2bn / Unrated 1–2bn / Eligible / Excluded)</w:t>
+              <w:t>The platform-computed advance-rate tier (Rated Investor / Unrated NAV &gt; $1Bn / FoF &amp; Other &gt; $10Bn AUM / Corp Pension &gt; $5Bn Assets / Other Institutional / Excluded)</w:t>
             </w:r>
           </w:p>
         </w:tc>

</xml_diff>